<commit_message>
Reemplazar pregunta 25 del Certamen 2
Co-Authored-By: Claude Sonnet 5.5 <noreply@anthropic.com>
Claude-Session: https://claude.ai/code/session_01AkNEH9QvRP5iSWKqiGfSq1
</commit_message>
<xml_diff>
--- a/Certamen2_Investigacion_Odontologia_I.docx
+++ b/Certamen2_Investigacion_Odontologia_I.docx
@@ -5856,167 +5856,167 @@
           <w:u w:val="none"/>
           <w:lang w:val="en-US"/>
         </w:rPr>
-        <w:t>25. ¿Qué documento, surgido de los juicios a médicos nazis, establece que el consentimiento voluntario del sujeto es absolutamente esencial?</w:t>
-      </w:r>
-    </w:p>
-    <w:p>
-      <w:pPr>
-        <w:pStyle w:val="ListParagraph"/>
-        <w:spacing w:before="220" w:beforeAutospacing="off" w:after="220" w:afterAutospacing="off"/>
-        <w:jc w:val="both"/>
-        <w:rPr>
-          <w:rFonts w:ascii="Barlow" w:hAnsi="Barlow" w:eastAsia="Barlow" w:cs="Barlow"/>
-          <w:b w:val="0"/>
-          <w:bCs w:val="0"/>
-          <w:i w:val="0"/>
-          <w:iCs w:val="0"/>
-          <w:strike w:val="0"/>
-          <w:dstrike w:val="0"/>
-          <w:noProof w:val="0"/>
-          <w:color w:val="000000" w:themeColor="text1" w:themeTint="FF" w:themeShade="FF"/>
-          <w:sz w:val="22"/>
-          <w:szCs w:val="22"/>
-          <w:u w:val="none"/>
-          <w:lang w:val="en-US"/>
-        </w:rPr>
-      </w:pPr>
-      <w:r>
-        <w:rPr>
-          <w:rFonts w:ascii="Barlow" w:hAnsi="Barlow" w:eastAsia="Barlow" w:cs="Barlow"/>
-          <w:b w:val="0"/>
-          <w:bCs w:val="0"/>
-          <w:i w:val="0"/>
-          <w:iCs w:val="0"/>
-          <w:strike w:val="0"/>
-          <w:dstrike w:val="0"/>
-          <w:noProof w:val="0"/>
-          <w:color w:val="000000" w:themeColor="text1" w:themeTint="FF" w:themeShade="FF"/>
-          <w:sz w:val="22"/>
-          <w:szCs w:val="22"/>
-          <w:u w:val="none"/>
-          <w:lang w:val="en-US"/>
-        </w:rPr>
-        <w:t>A) Código de Nuremberg</w:t>
-      </w:r>
-    </w:p>
-    <w:p>
-      <w:pPr>
-        <w:pStyle w:val="ListParagraph"/>
-        <w:spacing w:before="220" w:beforeAutospacing="off" w:after="220" w:afterAutospacing="off"/>
-        <w:jc w:val="both"/>
-        <w:rPr>
-          <w:rFonts w:ascii="Barlow" w:hAnsi="Barlow" w:eastAsia="Barlow" w:cs="Barlow"/>
-          <w:b w:val="0"/>
-          <w:bCs w:val="0"/>
-          <w:i w:val="0"/>
-          <w:iCs w:val="0"/>
-          <w:strike w:val="0"/>
-          <w:dstrike w:val="0"/>
-          <w:noProof w:val="0"/>
-          <w:color w:val="000000" w:themeColor="text1" w:themeTint="FF" w:themeShade="FF"/>
-          <w:sz w:val="22"/>
-          <w:szCs w:val="22"/>
-          <w:u w:val="none"/>
-          <w:lang w:val="en-US"/>
-        </w:rPr>
-      </w:pPr>
-      <w:r>
-        <w:rPr>
-          <w:rFonts w:ascii="Barlow" w:hAnsi="Barlow" w:eastAsia="Barlow" w:cs="Barlow"/>
-          <w:b w:val="0"/>
-          <w:bCs w:val="0"/>
-          <w:i w:val="0"/>
-          <w:iCs w:val="0"/>
-          <w:strike w:val="0"/>
-          <w:dstrike w:val="0"/>
-          <w:noProof w:val="0"/>
-          <w:color w:val="000000" w:themeColor="text1" w:themeTint="FF" w:themeShade="FF"/>
-          <w:sz w:val="22"/>
-          <w:szCs w:val="22"/>
-          <w:u w:val="none"/>
-          <w:lang w:val="en-US"/>
-        </w:rPr>
-        <w:t>B) Informe Belmont</w:t>
-      </w:r>
-    </w:p>
-    <w:p>
-      <w:pPr>
-        <w:pStyle w:val="ListParagraph"/>
-        <w:spacing w:before="220" w:beforeAutospacing="off" w:after="220" w:afterAutospacing="off"/>
-        <w:jc w:val="both"/>
-        <w:rPr>
-          <w:rFonts w:ascii="Barlow" w:hAnsi="Barlow" w:eastAsia="Barlow" w:cs="Barlow"/>
-          <w:b w:val="0"/>
-          <w:bCs w:val="0"/>
-          <w:i w:val="0"/>
-          <w:iCs w:val="0"/>
-          <w:strike w:val="0"/>
-          <w:dstrike w:val="0"/>
-          <w:noProof w:val="0"/>
-          <w:color w:val="000000" w:themeColor="text1" w:themeTint="FF" w:themeShade="FF"/>
-          <w:sz w:val="22"/>
-          <w:szCs w:val="22"/>
-          <w:u w:val="none"/>
-          <w:lang w:val="en-US"/>
-        </w:rPr>
-      </w:pPr>
-      <w:r>
-        <w:rPr>
-          <w:rFonts w:ascii="Barlow" w:hAnsi="Barlow" w:eastAsia="Barlow" w:cs="Barlow"/>
-          <w:b w:val="0"/>
-          <w:bCs w:val="0"/>
-          <w:i w:val="0"/>
-          <w:iCs w:val="0"/>
-          <w:strike w:val="0"/>
-          <w:dstrike w:val="0"/>
-          <w:noProof w:val="0"/>
-          <w:color w:val="000000" w:themeColor="text1" w:themeTint="FF" w:themeShade="FF"/>
-          <w:sz w:val="22"/>
-          <w:szCs w:val="22"/>
-          <w:u w:val="none"/>
-          <w:lang w:val="en-US"/>
-        </w:rPr>
-        <w:t>C) Declaración de Ginebra</w:t>
-      </w:r>
-    </w:p>
-    <w:p>
-      <w:pPr>
-        <w:pStyle w:val="ListParagraph"/>
-        <w:spacing w:before="220" w:beforeAutospacing="off" w:after="220" w:afterAutospacing="off"/>
-        <w:jc w:val="both"/>
-        <w:rPr>
-          <w:rFonts w:ascii="Barlow" w:hAnsi="Barlow" w:eastAsia="Barlow" w:cs="Barlow"/>
-          <w:b w:val="0"/>
-          <w:bCs w:val="0"/>
-          <w:i w:val="0"/>
-          <w:iCs w:val="0"/>
-          <w:strike w:val="0"/>
-          <w:dstrike w:val="0"/>
-          <w:noProof w:val="0"/>
-          <w:color w:val="000000" w:themeColor="text1" w:themeTint="FF" w:themeShade="FF"/>
-          <w:sz w:val="22"/>
-          <w:szCs w:val="22"/>
-          <w:u w:val="none"/>
-          <w:lang w:val="en-US"/>
-        </w:rPr>
-      </w:pPr>
-      <w:r>
-        <w:rPr>
-          <w:rFonts w:ascii="Barlow" w:hAnsi="Barlow" w:eastAsia="Barlow" w:cs="Barlow"/>
-          <w:b w:val="0"/>
-          <w:bCs w:val="0"/>
-          <w:i w:val="0"/>
-          <w:iCs w:val="0"/>
-          <w:strike w:val="0"/>
-          <w:dstrike w:val="0"/>
-          <w:noProof w:val="0"/>
-          <w:color w:val="000000" w:themeColor="text1" w:themeTint="FF" w:themeShade="FF"/>
-          <w:sz w:val="22"/>
-          <w:szCs w:val="22"/>
-          <w:u w:val="none"/>
-          <w:lang w:val="en-US"/>
-        </w:rPr>
-        <w:t>D) Pautas CIOMS</w:t>
+        <w:t>25. ¿Cuál de los siguientes elementos debe garantizarse al obtener el consentimiento informado de un participante en una investigación?</w:t>
+      </w:r>
+    </w:p>
+    <w:p>
+      <w:pPr>
+        <w:pStyle w:val="ListParagraph"/>
+        <w:spacing w:before="220" w:beforeAutospacing="off" w:after="220" w:afterAutospacing="off"/>
+        <w:jc w:val="both"/>
+        <w:rPr>
+          <w:rFonts w:ascii="Barlow" w:hAnsi="Barlow" w:eastAsia="Barlow" w:cs="Barlow"/>
+          <w:b w:val="0"/>
+          <w:bCs w:val="0"/>
+          <w:i w:val="0"/>
+          <w:iCs w:val="0"/>
+          <w:strike w:val="0"/>
+          <w:dstrike w:val="0"/>
+          <w:noProof w:val="0"/>
+          <w:color w:val="000000" w:themeColor="text1" w:themeTint="FF" w:themeShade="FF"/>
+          <w:sz w:val="22"/>
+          <w:szCs w:val="22"/>
+          <w:u w:val="none"/>
+          <w:lang w:val="en-US"/>
+        </w:rPr>
+      </w:pPr>
+      <w:r>
+        <w:rPr>
+          <w:rFonts w:ascii="Barlow" w:hAnsi="Barlow" w:eastAsia="Barlow" w:cs="Barlow"/>
+          <w:b w:val="0"/>
+          <w:bCs w:val="0"/>
+          <w:i w:val="0"/>
+          <w:iCs w:val="0"/>
+          <w:strike w:val="0"/>
+          <w:dstrike w:val="0"/>
+          <w:noProof w:val="0"/>
+          <w:color w:val="000000" w:themeColor="text1" w:themeTint="FF" w:themeShade="FF"/>
+          <w:sz w:val="22"/>
+          <w:szCs w:val="22"/>
+          <w:u w:val="none"/>
+          <w:lang w:val="en-US"/>
+        </w:rPr>
+        <w:t>A) Que el participante pueda retirarse del estudio en cualquier momento, sin sanción ni pérdida de beneficios</w:t>
+      </w:r>
+    </w:p>
+    <w:p>
+      <w:pPr>
+        <w:pStyle w:val="ListParagraph"/>
+        <w:spacing w:before="220" w:beforeAutospacing="off" w:after="220" w:afterAutospacing="off"/>
+        <w:jc w:val="both"/>
+        <w:rPr>
+          <w:rFonts w:ascii="Barlow" w:hAnsi="Barlow" w:eastAsia="Barlow" w:cs="Barlow"/>
+          <w:b w:val="0"/>
+          <w:bCs w:val="0"/>
+          <w:i w:val="0"/>
+          <w:iCs w:val="0"/>
+          <w:strike w:val="0"/>
+          <w:dstrike w:val="0"/>
+          <w:noProof w:val="0"/>
+          <w:color w:val="000000" w:themeColor="text1" w:themeTint="FF" w:themeShade="FF"/>
+          <w:sz w:val="22"/>
+          <w:szCs w:val="22"/>
+          <w:u w:val="none"/>
+          <w:lang w:val="en-US"/>
+        </w:rPr>
+      </w:pPr>
+      <w:r>
+        <w:rPr>
+          <w:rFonts w:ascii="Barlow" w:hAnsi="Barlow" w:eastAsia="Barlow" w:cs="Barlow"/>
+          <w:b w:val="0"/>
+          <w:bCs w:val="0"/>
+          <w:i w:val="0"/>
+          <w:iCs w:val="0"/>
+          <w:strike w:val="0"/>
+          <w:dstrike w:val="0"/>
+          <w:noProof w:val="0"/>
+          <w:color w:val="000000" w:themeColor="text1" w:themeTint="FF" w:themeShade="FF"/>
+          <w:sz w:val="22"/>
+          <w:szCs w:val="22"/>
+          <w:u w:val="none"/>
+          <w:lang w:val="en-US"/>
+        </w:rPr>
+        <w:t>B) Que el participante firme el documento antes de recibir información sobre el estudio</w:t>
+      </w:r>
+    </w:p>
+    <w:p>
+      <w:pPr>
+        <w:pStyle w:val="ListParagraph"/>
+        <w:spacing w:before="220" w:beforeAutospacing="off" w:after="220" w:afterAutospacing="off"/>
+        <w:jc w:val="both"/>
+        <w:rPr>
+          <w:rFonts w:ascii="Barlow" w:hAnsi="Barlow" w:eastAsia="Barlow" w:cs="Barlow"/>
+          <w:b w:val="0"/>
+          <w:bCs w:val="0"/>
+          <w:i w:val="0"/>
+          <w:iCs w:val="0"/>
+          <w:strike w:val="0"/>
+          <w:dstrike w:val="0"/>
+          <w:noProof w:val="0"/>
+          <w:color w:val="000000" w:themeColor="text1" w:themeTint="FF" w:themeShade="FF"/>
+          <w:sz w:val="22"/>
+          <w:szCs w:val="22"/>
+          <w:u w:val="none"/>
+          <w:lang w:val="en-US"/>
+        </w:rPr>
+      </w:pPr>
+      <w:r>
+        <w:rPr>
+          <w:rFonts w:ascii="Barlow" w:hAnsi="Barlow" w:eastAsia="Barlow" w:cs="Barlow"/>
+          <w:b w:val="0"/>
+          <w:bCs w:val="0"/>
+          <w:i w:val="0"/>
+          <w:iCs w:val="0"/>
+          <w:strike w:val="0"/>
+          <w:dstrike w:val="0"/>
+          <w:noProof w:val="0"/>
+          <w:color w:val="000000" w:themeColor="text1" w:themeTint="FF" w:themeShade="FF"/>
+          <w:sz w:val="22"/>
+          <w:szCs w:val="22"/>
+          <w:u w:val="none"/>
+          <w:lang w:val="en-US"/>
+        </w:rPr>
+        <w:t>C) Que la decisión de participar sea tomada por el investigador responsable</w:t>
+      </w:r>
+    </w:p>
+    <w:p>
+      <w:pPr>
+        <w:pStyle w:val="ListParagraph"/>
+        <w:spacing w:before="220" w:beforeAutospacing="off" w:after="220" w:afterAutospacing="off"/>
+        <w:jc w:val="both"/>
+        <w:rPr>
+          <w:rFonts w:ascii="Barlow" w:hAnsi="Barlow" w:eastAsia="Barlow" w:cs="Barlow"/>
+          <w:b w:val="0"/>
+          <w:bCs w:val="0"/>
+          <w:i w:val="0"/>
+          <w:iCs w:val="0"/>
+          <w:strike w:val="0"/>
+          <w:dstrike w:val="0"/>
+          <w:noProof w:val="0"/>
+          <w:color w:val="000000" w:themeColor="text1" w:themeTint="FF" w:themeShade="FF"/>
+          <w:sz w:val="22"/>
+          <w:szCs w:val="22"/>
+          <w:u w:val="none"/>
+          <w:lang w:val="en-US"/>
+        </w:rPr>
+      </w:pPr>
+      <w:r>
+        <w:rPr>
+          <w:rFonts w:ascii="Barlow" w:hAnsi="Barlow" w:eastAsia="Barlow" w:cs="Barlow"/>
+          <w:b w:val="0"/>
+          <w:bCs w:val="0"/>
+          <w:i w:val="0"/>
+          <w:iCs w:val="0"/>
+          <w:strike w:val="0"/>
+          <w:dstrike w:val="0"/>
+          <w:noProof w:val="0"/>
+          <w:color w:val="000000" w:themeColor="text1" w:themeTint="FF" w:themeShade="FF"/>
+          <w:sz w:val="22"/>
+          <w:szCs w:val="22"/>
+          <w:u w:val="none"/>
+          <w:lang w:val="en-US"/>
+        </w:rPr>
+        <w:t>D) Que el participante renuncie a conocer los resultados del estudio</w:t>
       </w:r>
     </w:p>
     <w:p>

</xml_diff>